<commit_message>
correcciones de unificacion visual y logica de todos los clientes
</commit_message>
<xml_diff>
--- a/U1/TI.1.1/TI.1.1. PAO202651_RESTFUL_DOTNET_SINBDD_NRC36884_GR09/01. UML/01. ERS/ERS_RESTFUL_DOTNET_SINBDD_NRC36884_GR09.docx
+++ b/U1/TI.1.1/TI.1.1. PAO202651_RESTFUL_DOTNET_SINBDD_NRC36884_GR09/01. UML/01. ERS/ERS_RESTFUL_DOTNET_SINBDD_NRC36884_GR09.docx
@@ -753,7 +753,7 @@
                 <w:sz w:val="18"/>
                 <w:szCs w:val="18"/>
               </w:rPr>
-              <w:t xml:space="preserve">Convertir centímetros, metros, pies, yardas y millas.</w:t>
+              <w:t xml:space="preserve">Convertir milímetros, centímetros, metros, kilómetros, pies, yardas y millas.</w:t>
             </w:r>
           </w:p>
         </w:tc>
@@ -812,7 +812,7 @@
                 <w:sz w:val="18"/>
                 <w:szCs w:val="18"/>
               </w:rPr>
-              <w:t xml:space="preserve">Convertir gramos, kilogramos, onzas, libras y quintales.</w:t>
+              <w:t xml:space="preserve">Convertir miligramos, gramos, kilogramos, toneladas, onzas, libras y quintales.</w:t>
             </w:r>
           </w:p>
         </w:tc>
@@ -871,7 +871,7 @@
                 <w:sz w:val="18"/>
                 <w:szCs w:val="18"/>
               </w:rPr>
-              <w:t xml:space="preserve">Convertir Fahrenheit, Kelvin, Celsius, Newton y Réaumur.</w:t>
+              <w:t xml:space="preserve">Convertir Celsius, Fahrenheit, Kelvin, Rankine, Newton y Réaumur.</w:t>
             </w:r>
           </w:p>
         </w:tc>
@@ -2173,7 +2173,7 @@
                 <w:sz w:val="18"/>
                 <w:szCs w:val="18"/>
               </w:rPr>
-              <w:t xml:space="preserve">centimetros, metros, pies, yardas, millas</w:t>
+              <w:t xml:space="preserve">milimetros, centimetros, metros, kilometros, pies, yardas, millas</w:t>
             </w:r>
           </w:p>
         </w:tc>
@@ -2232,7 +2232,7 @@
                 <w:sz w:val="18"/>
                 <w:szCs w:val="18"/>
               </w:rPr>
-              <w:t xml:space="preserve">gramos, kilogramos, onzas, libras, quintales</w:t>
+              <w:t xml:space="preserve">miligramos, gramos, kilogramos, toneladas, onzas, libras, quintales</w:t>
             </w:r>
           </w:p>
         </w:tc>
@@ -2291,7 +2291,7 @@
                 <w:sz w:val="18"/>
                 <w:szCs w:val="18"/>
               </w:rPr>
-              <w:t xml:space="preserve">fahrenheit, kelvin, celsius, newton, reaumur</w:t>
+              <w:t xml:space="preserve">celsius, fahrenheit, kelvin, rankine, newton, reaumur</w:t>
             </w:r>
           </w:p>
         </w:tc>

</xml_diff>

<commit_message>
docs(u1): sincronizar ERS con contratos GR09
Actualizar ERS REST Java, REST .NET y SOAP .NET según operaciones, validaciones, unidades, configuración y credenciales documentadas en cada implementación.
</commit_message>
<xml_diff>
--- a/U1/TI.1.1/TI.1.1. PAO202651_RESTFUL_DOTNET_SINBDD_NRC36884_GR09/01. UML/01. ERS/ERS_RESTFUL_DOTNET_SINBDD_NRC36884_GR09.docx
+++ b/U1/TI.1.1/TI.1.1. PAO202651_RESTFUL_DOTNET_SINBDD_NRC36884_GR09/01. UML/01. ERS/ERS_RESTFUL_DOTNET_SINBDD_NRC36884_GR09.docx
@@ -65,7 +65,7 @@
           <w:sz w:val="22"/>
           <w:szCs w:val="22"/>
         </w:rPr>
-        <w:t xml:space="preserve">Fecha: 13 de octubre de 2026</w:t>
+        <w:t>Fecha: 14 de octubre de 2026</w:t>
       </w:r>
     </w:p>
     <w:p>
@@ -1048,7 +1048,7 @@
                 <w:sz w:val="18"/>
                 <w:szCs w:val="18"/>
               </w:rPr>
-              <w:t xml:space="preserve">Informar entradas inválidas, credenciales incorrectas, unidades no soportadas y rutas inexistentes en JSON.</w:t>
+              <w:t>Rechaza campos obligatorios vacíos, credenciales incorrectas, valores no finitos, masa negativa y magnitudes o unidades no admitidas; responde con JSON y código HTTP apropiado.</w:t>
             </w:r>
           </w:p>
         </w:tc>
@@ -2192,7 +2192,7 @@
                 <w:sz w:val="18"/>
                 <w:szCs w:val="18"/>
               </w:rPr>
-              <w:t xml:space="preserve">Factores respecto al metro: 0,01; 1; 0,3048; 0,9144; 1609,344.</w:t>
+              <w:t>Factores respecto al metro: mm 0,001; cm 0,01; m 1; km 1 000; pies 0,3048; yardas 0,9144; millas 1 609,344.</w:t>
             </w:r>
           </w:p>
         </w:tc>
@@ -2251,7 +2251,7 @@
                 <w:sz w:val="18"/>
                 <w:szCs w:val="18"/>
               </w:rPr>
-              <w:t xml:space="preserve">Factores respecto al kilogramo: 0,001; 1; 0,028349523125; 0,45359237; 100.</w:t>
+              <w:t>Factores respecto al kilogramo: mg 0,000001; g 0,001; kg 1; t 1 000; oz 0,028349523125; lb 0,45359237; quintal 100.</w:t>
             </w:r>
           </w:p>
         </w:tc>
@@ -2350,7 +2350,7 @@
         <w:pStyle w:val="ListParagraph"/>
       </w:pPr>
       <w:r>
-        <w:t xml:space="preserve">•  Credenciales iniciales configuradas: usuario monster y clave monster9. El usuario y la clave se pueden ajustar en appsettings.json.</w:t>
+        <w:t>•  Credenciales iniciales configuradas: usuario Monster y clave Monster9. El usuario y la clave se pueden ajustar en appsettings.json.</w:t>
       </w:r>
     </w:p>
     <w:p>

</xml_diff>